<commit_message>
Add Codex-native paper curation artifacts
</commit_message>
<xml_diff>
--- a/paper/review_en.docx
+++ b/paper/review_en.docx
@@ -12,7 +12,7 @@
     </w:p>
     <w:p>
       <w:r>
-        <w:t>Generated: 2026-06-30 | Dataset: 12,700 papers</w:t>
+        <w:t>Generated: 2026-07-01 | Dataset: 12,700 papers</w:t>
       </w:r>
     </w:p>
     <w:p>
@@ -41,7 +41,7 @@
         <w:pStyle w:val="ListBullet"/>
       </w:pPr>
       <w:r>
-        <w:t>The selected papers account for 3,134,857 citations in the selected set, with the largest citation mass in 2010.</w:t>
+        <w:t>The selected papers account for 4,897,708 citations in the selected set, with the largest citation mass in 2009.</w:t>
       </w:r>
     </w:p>
     <w:p>
@@ -49,7 +49,7 @@
         <w:pStyle w:val="ListBullet"/>
       </w:pPr>
       <w:r>
-        <w:t>The largest taxonomy category is General Brain-AI Structure Reviews and Methods (5,990 papers).</w:t>
+        <w:t>The largest taxonomy category is General Brain-AI Structure Reviews and Methods (4,034 papers).</w:t>
       </w:r>
     </w:p>
     <w:p>
@@ -81,7 +81,7 @@
         <w:pStyle w:val="ListBullet"/>
       </w:pPr>
       <w:r>
-        <w:t>General Brain-AI Structure Reviews and Methods: 5,990 papers (47.2%)</w:t>
+        <w:t>General Brain-AI Structure Reviews and Methods: 4,034 papers (31.8%)</w:t>
       </w:r>
     </w:p>
     <w:p>
@@ -89,7 +89,7 @@
         <w:pStyle w:val="ListBullet"/>
       </w:pPr>
       <w:r>
-        <w:t>Cellular, Synaptic, and Neuromorphic Foundations: 1,943 papers (15.3%)</w:t>
+        <w:t>Cellular, Synaptic, and Neuromorphic Foundations: 3,631 papers (28.6%)</w:t>
       </w:r>
     </w:p>
     <w:p>
@@ -97,7 +97,7 @@
         <w:pStyle w:val="ListBullet"/>
       </w:pPr>
       <w:r>
-        <w:t>Clinical NeuroAI and Brain Disorders: 1,250 papers (9.8%)</w:t>
+        <w:t>Cognitive Architectures, Learning, and Systems Neuroscience: 1,259 papers (9.9%)</w:t>
       </w:r>
     </w:p>
     <w:p>
@@ -105,7 +105,7 @@
         <w:pStyle w:val="ListBullet"/>
       </w:pPr>
       <w:r>
-        <w:t>Connectomics, Graph Models, and Brain Networks: 909 papers (7.2%)</w:t>
+        <w:t>Electrophysiology, Neural Signals, and AI Decoding: 1,103 papers (8.7%)</w:t>
       </w:r>
     </w:p>
     <w:p>
@@ -113,7 +113,7 @@
         <w:pStyle w:val="ListBullet"/>
       </w:pPr>
       <w:r>
-        <w:t>Cognitive Architectures, Learning, and Systems Neuroscience: 732 papers (5.8%)</w:t>
+        <w:t>Clinical NeuroAI and Brain Disorders: 929 papers (7.3%)</w:t>
       </w:r>
     </w:p>
     <w:p>
@@ -121,7 +121,7 @@
         <w:pStyle w:val="ListBullet"/>
       </w:pPr>
       <w:r>
-        <w:t>Computational Neuroscience and Brain-Inspired AI: 639 papers (5.0%)</w:t>
+        <w:t>Connectomics, Graph Models, and Brain Networks: 892 papers (7.0%)</w:t>
       </w:r>
     </w:p>
     <w:p>
@@ -129,7 +129,7 @@
         <w:pStyle w:val="ListBullet"/>
       </w:pPr>
       <w:r>
-        <w:t>Structural Neuroimaging and AI: 539 papers (4.2%)</w:t>
+        <w:t>Computational Neuroscience and Brain-Inspired AI: 341 papers (2.7%)</w:t>
       </w:r>
     </w:p>
     <w:p>
@@ -137,7 +137,7 @@
         <w:pStyle w:val="ListBullet"/>
       </w:pPr>
       <w:r>
-        <w:t>Electrophysiology, Neural Signals, and AI Decoding: 452 papers (3.6%)</w:t>
+        <w:t>Structural Neuroimaging and AI: 278 papers (2.2%)</w:t>
       </w:r>
     </w:p>
     <w:p>
@@ -145,7 +145,7 @@
         <w:pStyle w:val="ListBullet"/>
       </w:pPr>
       <w:r>
-        <w:t>Brain Decoding, Representation Learning, and BCI: 246 papers (1.9%)</w:t>
+        <w:t>Brain Decoding, Representation Learning, and BCI: 233 papers (1.8%)</w:t>
       </w:r>
     </w:p>
     <w:p>
@@ -161,7 +161,23 @@
         <w:pStyle w:val="ListNumber"/>
       </w:pPr>
       <w:r>
+        <w:t>1962 #1: Receptive fields, binocular interaction and functional architecture in the cat's visual cortex (13,787 citations)</w:t>
+      </w:r>
+    </w:p>
+    <w:p>
+      <w:pPr>
+        <w:pStyle w:val="ListNumber"/>
+      </w:pPr>
+      <w:r>
         <w:t>2007 #1: The 2007 WHO Classification of Tumours of the Central Nervous System (12,921 citations)</w:t>
+      </w:r>
+    </w:p>
+    <w:p>
+      <w:pPr>
+        <w:pStyle w:val="ListNumber"/>
+      </w:pPr>
+      <w:r>
+        <w:t>2001 #1: An integrative theory of prefrontal cortex function. (12,649 citations)</w:t>
       </w:r>
     </w:p>
     <w:p>
@@ -177,7 +193,31 @@
         <w:pStyle w:val="ListNumber"/>
       </w:pPr>
       <w:r>
+        <w:t>2009 #1: Complex brain networks: graph theoretical analysis of structural and functional systems (11,616 citations)</w:t>
+      </w:r>
+    </w:p>
+    <w:p>
+      <w:pPr>
+        <w:pStyle w:val="ListNumber"/>
+      </w:pPr>
+      <w:r>
+        <w:t>2010 #1: Complex network measures of brain connectivity: Uses and interpretations (11,060 citations)</w:t>
+      </w:r>
+    </w:p>
+    <w:p>
+      <w:pPr>
+        <w:pStyle w:val="ListNumber"/>
+      </w:pPr>
+      <w:r>
         <w:t>2021 #1: The 2021 WHO Classification of Tumors of the Central Nervous System: a summary. (9,425 citations)</w:t>
+      </w:r>
+    </w:p>
+    <w:p>
+      <w:pPr>
+        <w:pStyle w:val="ListNumber"/>
+      </w:pPr>
+      <w:r>
+        <w:t>1993 #1: WAF1, a potential mediator of p53 tumor suppression. (8,773 citations)</w:t>
       </w:r>
     </w:p>
     <w:p>
@@ -201,6 +241,14 @@
         <w:pStyle w:val="ListNumber"/>
       </w:pPr>
       <w:r>
+        <w:t>2005 #1: The human brain is intrinsically organized into dynamic, anticorrelated functional networks. (8,392 citations)</w:t>
+      </w:r>
+    </w:p>
+    <w:p>
+      <w:pPr>
+        <w:pStyle w:val="ListNumber"/>
+      </w:pPr>
+      <w:r>
         <w:t>1991 #1: Distributed hierarchical processing in the primate cerebral cortex. (8,380 citations)</w:t>
       </w:r>
     </w:p>
@@ -217,7 +265,7 @@
         <w:pStyle w:val="ListNumber"/>
       </w:pPr>
       <w:r>
-        <w:t>2011 #1: The organization of the human cerebral cortex estimated by intrinsic functional connectivity (7,655 citations)</w:t>
+        <w:t>2004 #1: Identification of human brain tumour initiating cells (7,655 citations)</w:t>
       </w:r>
     </w:p>
     <w:p>
@@ -225,55 +273,7 @@
         <w:pStyle w:val="ListNumber"/>
       </w:pPr>
       <w:r>
-        <w:t>2001 #1: Segmentation of brain MR images through a hidden Markov random field model and the expectation-maximization algorithm (7,350 citations)</w:t>
-      </w:r>
-    </w:p>
-    <w:p>
-      <w:pPr>
-        <w:pStyle w:val="ListNumber"/>
-      </w:pPr>
-      <w:r>
-        <w:t>2010 #1: An integrated genomic analysis identifies clinically relevant subtypes of glioblastoma characterized by abnormalities in PDGFRA, IDH1, EGFR and NF1 (7,131 citations)</w:t>
-      </w:r>
-    </w:p>
-    <w:p>
-      <w:pPr>
-        <w:pStyle w:val="ListNumber"/>
-      </w:pPr>
-      <w:r>
-        <w:t>2002 #1: Functional connectivity in the resting brain: A network analysis of the default mode hypothesis (6,478 citations)</w:t>
-      </w:r>
-    </w:p>
-    <w:p>
-      <w:pPr>
-        <w:pStyle w:val="ListNumber"/>
-      </w:pPr>
-      <w:r>
-        <w:t>2009 #1: A robust and high-throughput Cre reporting and characterization system for the whole mouse brain (6,451 citations)</w:t>
-      </w:r>
-    </w:p>
-    <w:p>
-      <w:pPr>
-        <w:pStyle w:val="ListNumber"/>
-      </w:pPr>
-      <w:r>
-        <w:t>2014 #1: The Multimodal Brain Tumor Image Segmentation Benchmark (BRATS) (6,230 citations)</w:t>
-      </w:r>
-    </w:p>
-    <w:p>
-      <w:pPr>
-        <w:pStyle w:val="ListNumber"/>
-      </w:pPr>
-      <w:r>
-        <w:t>2000 #1: Measuring the thickness of the human cerebral cortex from magnetic resonance images. (5,956 citations)</w:t>
-      </w:r>
-    </w:p>
-    <w:p>
-      <w:pPr>
-        <w:pStyle w:val="ListNumber"/>
-      </w:pPr>
-      <w:r>
-        <w:t>2008 #1: An Integrated Genomic Analysis of Human Glioblastoma Multiforme (5,464 citations)</w:t>
+        <w:t>2011 #1: The organization of the human cerebral cortex estimated by intrinsic functional connectivity (7,655 citations)</w:t>
       </w:r>
     </w:p>
     <w:p>
@@ -321,7 +321,23 @@
         <w:pStyle w:val="ListNumber"/>
       </w:pPr>
       <w:r>
+        <w:t>D. Hubel, T. Wiesel. (1962). Receptive fields, binocular interaction and functional architecture in the cat's visual cortex. Journal of Physiology. https://doi.org/10.1113/jphysiol.1962.sp006837</w:t>
+      </w:r>
+    </w:p>
+    <w:p>
+      <w:pPr>
+        <w:pStyle w:val="ListNumber"/>
+      </w:pPr>
+      <w:r>
         <w:t>D. Louis, H. Ohgaki, O. Wiestler, W. Cavenee, P. Burger, A. Jouvet, et al.. (2007). The 2007 WHO Classification of Tumours of the Central Nervous System. Acta Neuropathologica. https://doi.org/10.1007/s00401-007-0243-4</w:t>
+      </w:r>
+    </w:p>
+    <w:p>
+      <w:pPr>
+        <w:pStyle w:val="ListNumber"/>
+      </w:pPr>
+      <w:r>
+        <w:t>E. Miller, J. Cohen. (2001). An integrative theory of prefrontal cortex function.. Annual Review of Neuroscience. https://doi.org/10.1146/ANNUREV.NEURO.24.1.167</w:t>
       </w:r>
     </w:p>
     <w:p>
@@ -337,7 +353,31 @@
         <w:pStyle w:val="ListNumber"/>
       </w:pPr>
       <w:r>
+        <w:t>E. Bullmore, O. Sporns. (2009). Complex brain networks: graph theoretical analysis of structural and functional systems. Nature Reviews Neuroscience. https://doi.org/10.1038/nrn2575</w:t>
+      </w:r>
+    </w:p>
+    <w:p>
+      <w:pPr>
+        <w:pStyle w:val="ListNumber"/>
+      </w:pPr>
+      <w:r>
+        <w:t>M. Rubinov, O. Sporns. (2010). Complex network measures of brain connectivity: Uses and interpretations. NeuroImage. https://doi.org/10.1016/j.neuroimage.2009.10.003</w:t>
+      </w:r>
+    </w:p>
+    <w:p>
+      <w:pPr>
+        <w:pStyle w:val="ListNumber"/>
+      </w:pPr>
+      <w:r>
         <w:t>D. Louis, A. Perry, P. Wesseling, D. Brat, I. Cree, D. Figarella-Branger, et al.. (2021). The 2021 WHO Classification of Tumors of the Central Nervous System: a summary.. Neuro-Oncology. https://doi.org/10.1093/neuonc/noab106</w:t>
+      </w:r>
+    </w:p>
+    <w:p>
+      <w:pPr>
+        <w:pStyle w:val="ListNumber"/>
+      </w:pPr>
+      <w:r>
+        <w:t>W. El-Deiry, T. Tokino, V. Velculescu, D. B. Levy, R. Parsons, J. Trent, et al.. (1993). WAF1, a potential mediator of p53 tumor suppression.. Cell. https://doi.org/10.1016/0092-8674(93)90500-P</w:t>
       </w:r>
     </w:p>
     <w:p>
@@ -361,6 +401,14 @@
         <w:pStyle w:val="ListNumber"/>
       </w:pPr>
       <w:r>
+        <w:t>Michael D Fox, Abraham Z Snyder, Justin L. Vincent, M. Corbetta, David C van Essen, Marc Raichle. (2005). The human brain is intrinsically organized into dynamic, anticorrelated functional networks.. Proceedings of the National Academy of Sciences of the United States of America. https://doi.org/10.1073/PNAS.0504136102</w:t>
+      </w:r>
+    </w:p>
+    <w:p>
+      <w:pPr>
+        <w:pStyle w:val="ListNumber"/>
+      </w:pPr>
+      <w:r>
         <w:t>D. Felleman, D. C. Essen. (1991). Distributed hierarchical processing in the primate cerebral cortex.. Cerebral Cortex. https://doi.org/10.1093/CERCOR/1.1.1</w:t>
       </w:r>
     </w:p>
@@ -377,7 +425,7 @@
         <w:pStyle w:val="ListNumber"/>
       </w:pPr>
       <w:r>
-        <w:t>B. T. Yeo, Fenna M. Krienen, J. Sepulcre, M. Sabuncu, D. Lashkari, Marisa O. Hollinshead, et al.. (2011). The organization of the human cerebral cortex estimated by intrinsic functional connectivity. Unknown venue. https://www.semanticscholar.org/paper/8b9987663e58e844af1a65a8fa1c5380485a0692</w:t>
+        <w:t>Sheila K. Singh, C. Hawkins, I. Clarke, J. Squire, J. Bayani, T. Hide, et al.. (2004). Identification of human brain tumour initiating cells. Nature. https://doi.org/10.1038/nature03128</w:t>
       </w:r>
     </w:p>
     <w:p>
@@ -385,55 +433,7 @@
         <w:pStyle w:val="ListNumber"/>
       </w:pPr>
       <w:r>
-        <w:t>Yongyue Zhang, M. Brady, Stephen M. Smith. (2001). Segmentation of brain MR images through a hidden Markov random field model and the expectation-maximization algorithm. IEEE Transactions on Medical Imaging. https://doi.org/10.1109/42.906424</w:t>
-      </w:r>
-    </w:p>
-    <w:p>
-      <w:pPr>
-        <w:pStyle w:val="ListNumber"/>
-      </w:pPr>
-      <w:r>
-        <w:t>R. Verhaak, K. Hoadley, E. Purdom, V. Wang, Y. Qi, M. Wilkerson, et al.. (2010). An integrated genomic analysis identifies clinically relevant subtypes of glioblastoma characterized by abnormalities in PDGFRA, IDH1, EGFR and NF1. Cancer Cell. https://doi.org/10.1016/j.ccr.2009.12.020</w:t>
-      </w:r>
-    </w:p>
-    <w:p>
-      <w:pPr>
-        <w:pStyle w:val="ListNumber"/>
-      </w:pPr>
-      <w:r>
-        <w:t>M. Greicius, B. Krasnow, A. Reiss, V. Menon. (2002). Functional connectivity in the resting brain: A network analysis of the default mode hypothesis. Proceedings of the National Academy of Sciences of the United States of America. https://doi.org/10.1073/pnas.0135058100</w:t>
-      </w:r>
-    </w:p>
-    <w:p>
-      <w:pPr>
-        <w:pStyle w:val="ListNumber"/>
-      </w:pPr>
-      <w:r>
-        <w:t>L. Madisen, T. Zwingman, S. Sunkin, S. W. Oh, Hatim A. Zariwala, Hong Gu, et al.. (2009). A robust and high-throughput Cre reporting and characterization system for the whole mouse brain. Nature Neuroscience. https://doi.org/10.1038/nn.2467</w:t>
-      </w:r>
-    </w:p>
-    <w:p>
-      <w:pPr>
-        <w:pStyle w:val="ListNumber"/>
-      </w:pPr>
-      <w:r>
-        <w:t>Bjoern H Menze, A. Jakab, S. Bauer, Jayashree Kalpathy-Cramer, K. Farahani, J. Kirby, et al.. (2014). The Multimodal Brain Tumor Image Segmentation Benchmark (BRATS). IEEE Transactions on Medical Imaging. https://doi.org/10.1109/TMI.2014.2377694</w:t>
-      </w:r>
-    </w:p>
-    <w:p>
-      <w:pPr>
-        <w:pStyle w:val="ListNumber"/>
-      </w:pPr>
-      <w:r>
-        <w:t>B. Fischl, A. M. Dale. (2000). Measuring the thickness of the human cerebral cortex from magnetic resonance images.. Proceedings of the National Academy of Sciences of the United States of America. https://doi.org/10.1073/PNAS.200033797</w:t>
-      </w:r>
-    </w:p>
-    <w:p>
-      <w:pPr>
-        <w:pStyle w:val="ListNumber"/>
-      </w:pPr>
-      <w:r>
-        <w:t>D. W. Parsons, Siân Jones, Xiaosong Zhang, Jimmy Lin, R. Leary, P. Angenendt, et al.. (2008). An Integrated Genomic Analysis of Human Glioblastoma Multiforme. Science. https://doi.org/10.1126/science.1164382</w:t>
+        <w:t>B. T. Yeo, Fenna M. Krienen, J. Sepulcre, M. Sabuncu, D. Lashkari, Marisa O. Hollinshead, et al.. (2011). The organization of the human cerebral cortex estimated by intrinsic functional connectivity. Unknown venue. https://www.semanticscholar.org/paper/8b9987663e58e844af1a65a8fa1c5380485a0692</w:t>
       </w:r>
     </w:p>
     <w:sectPr>

</xml_diff>